<commit_message>
Update 📋 CompTIA Security+ (SY0-701) Flashcard Set.docx
</commit_message>
<xml_diff>
--- a/📋 CompTIA Security+ (SY0-701) Flashcard Set.docx
+++ b/📋 CompTIA Security+ (SY0-701) Flashcard Set.docx
@@ -86,7 +86,7 @@
       <w:pPr>
         <w:numPr>
           <w:ilvl w:val="0"/>
-          <w:numId w:val="9"/>
+          <w:numId w:val="12"/>
         </w:numPr>
         <w:spacing w:after="0" w:afterAutospacing="0" w:lineRule="auto"/>
         <w:ind w:left="720" w:hanging="360"/>
@@ -110,7 +110,7 @@
       <w:pPr>
         <w:numPr>
           <w:ilvl w:val="0"/>
-          <w:numId w:val="9"/>
+          <w:numId w:val="12"/>
         </w:numPr>
         <w:spacing w:after="0" w:afterAutospacing="0" w:lineRule="auto"/>
         <w:ind w:left="720" w:hanging="360"/>
@@ -128,7 +128,7 @@
       <w:pPr>
         <w:numPr>
           <w:ilvl w:val="1"/>
-          <w:numId w:val="9"/>
+          <w:numId w:val="12"/>
         </w:numPr>
         <w:spacing w:after="0" w:afterAutospacing="0" w:lineRule="auto"/>
         <w:ind w:left="1440" w:hanging="360"/>
@@ -152,7 +152,7 @@
       <w:pPr>
         <w:numPr>
           <w:ilvl w:val="1"/>
-          <w:numId w:val="9"/>
+          <w:numId w:val="12"/>
         </w:numPr>
         <w:spacing w:after="0" w:afterAutospacing="0" w:lineRule="auto"/>
         <w:ind w:left="1440" w:hanging="360"/>
@@ -176,7 +176,7 @@
       <w:pPr>
         <w:numPr>
           <w:ilvl w:val="1"/>
-          <w:numId w:val="9"/>
+          <w:numId w:val="12"/>
         </w:numPr>
         <w:spacing w:after="0" w:afterAutospacing="0" w:lineRule="auto"/>
         <w:ind w:left="1440" w:hanging="360"/>
@@ -200,7 +200,7 @@
       <w:pPr>
         <w:numPr>
           <w:ilvl w:val="1"/>
-          <w:numId w:val="9"/>
+          <w:numId w:val="12"/>
         </w:numPr>
         <w:spacing w:after="240" w:lineRule="auto"/>
         <w:ind w:left="1440" w:hanging="360"/>
@@ -252,7 +252,7 @@
       <w:pPr>
         <w:numPr>
           <w:ilvl w:val="0"/>
-          <w:numId w:val="8"/>
+          <w:numId w:val="11"/>
         </w:numPr>
         <w:spacing w:after="0" w:afterAutospacing="0" w:lineRule="auto"/>
         <w:ind w:left="720" w:hanging="360"/>
@@ -276,7 +276,7 @@
       <w:pPr>
         <w:numPr>
           <w:ilvl w:val="0"/>
-          <w:numId w:val="8"/>
+          <w:numId w:val="11"/>
         </w:numPr>
         <w:spacing w:after="0" w:afterAutospacing="0" w:lineRule="auto"/>
         <w:ind w:left="720" w:hanging="360"/>
@@ -294,7 +294,7 @@
       <w:pPr>
         <w:numPr>
           <w:ilvl w:val="1"/>
-          <w:numId w:val="8"/>
+          <w:numId w:val="11"/>
         </w:numPr>
         <w:spacing w:after="0" w:afterAutospacing="0" w:lineRule="auto"/>
         <w:ind w:left="1440" w:hanging="360"/>
@@ -318,7 +318,7 @@
       <w:pPr>
         <w:numPr>
           <w:ilvl w:val="1"/>
-          <w:numId w:val="8"/>
+          <w:numId w:val="11"/>
         </w:numPr>
         <w:spacing w:after="0" w:afterAutospacing="0" w:lineRule="auto"/>
         <w:ind w:left="1440" w:hanging="360"/>
@@ -342,7 +342,7 @@
       <w:pPr>
         <w:numPr>
           <w:ilvl w:val="1"/>
-          <w:numId w:val="8"/>
+          <w:numId w:val="11"/>
         </w:numPr>
         <w:spacing w:after="0" w:afterAutospacing="0" w:lineRule="auto"/>
         <w:ind w:left="1440" w:hanging="360"/>
@@ -366,7 +366,7 @@
       <w:pPr>
         <w:numPr>
           <w:ilvl w:val="1"/>
-          <w:numId w:val="8"/>
+          <w:numId w:val="11"/>
         </w:numPr>
         <w:spacing w:after="0" w:afterAutospacing="0" w:lineRule="auto"/>
         <w:ind w:left="1440" w:hanging="360"/>
@@ -390,7 +390,7 @@
       <w:pPr>
         <w:numPr>
           <w:ilvl w:val="1"/>
-          <w:numId w:val="8"/>
+          <w:numId w:val="11"/>
         </w:numPr>
         <w:spacing w:after="0" w:afterAutospacing="0" w:lineRule="auto"/>
         <w:ind w:left="1440" w:hanging="360"/>
@@ -414,7 +414,7 @@
       <w:pPr>
         <w:numPr>
           <w:ilvl w:val="1"/>
-          <w:numId w:val="8"/>
+          <w:numId w:val="11"/>
         </w:numPr>
         <w:spacing w:after="240" w:lineRule="auto"/>
         <w:ind w:left="1440" w:hanging="360"/>
@@ -466,7 +466,7 @@
       <w:pPr>
         <w:numPr>
           <w:ilvl w:val="0"/>
-          <w:numId w:val="12"/>
+          <w:numId w:val="15"/>
         </w:numPr>
         <w:spacing w:after="0" w:afterAutospacing="0" w:lineRule="auto"/>
         <w:ind w:left="720" w:hanging="360"/>
@@ -490,7 +490,7 @@
       <w:pPr>
         <w:numPr>
           <w:ilvl w:val="0"/>
-          <w:numId w:val="12"/>
+          <w:numId w:val="15"/>
         </w:numPr>
         <w:spacing w:after="0" w:afterAutospacing="0" w:lineRule="auto"/>
         <w:ind w:left="720" w:hanging="360"/>
@@ -508,7 +508,7 @@
       <w:pPr>
         <w:numPr>
           <w:ilvl w:val="1"/>
-          <w:numId w:val="12"/>
+          <w:numId w:val="15"/>
         </w:numPr>
         <w:spacing w:after="0" w:afterAutospacing="0" w:lineRule="auto"/>
         <w:ind w:left="1440" w:hanging="360"/>
@@ -532,7 +532,7 @@
       <w:pPr>
         <w:numPr>
           <w:ilvl w:val="1"/>
-          <w:numId w:val="12"/>
+          <w:numId w:val="15"/>
         </w:numPr>
         <w:spacing w:after="0" w:afterAutospacing="0" w:lineRule="auto"/>
         <w:ind w:left="1440" w:hanging="360"/>
@@ -556,7 +556,7 @@
       <w:pPr>
         <w:numPr>
           <w:ilvl w:val="1"/>
-          <w:numId w:val="12"/>
+          <w:numId w:val="15"/>
         </w:numPr>
         <w:spacing w:after="0" w:afterAutospacing="0" w:lineRule="auto"/>
         <w:ind w:left="1440" w:hanging="360"/>
@@ -580,7 +580,7 @@
       <w:pPr>
         <w:numPr>
           <w:ilvl w:val="1"/>
-          <w:numId w:val="12"/>
+          <w:numId w:val="15"/>
         </w:numPr>
         <w:spacing w:after="240" w:lineRule="auto"/>
         <w:ind w:left="1440" w:hanging="360"/>
@@ -798,7 +798,7 @@
       <w:pPr>
         <w:numPr>
           <w:ilvl w:val="0"/>
-          <w:numId w:val="13"/>
+          <w:numId w:val="16"/>
         </w:numPr>
         <w:spacing w:after="0" w:afterAutospacing="0" w:lineRule="auto"/>
         <w:ind w:left="720" w:hanging="360"/>
@@ -822,7 +822,7 @@
       <w:pPr>
         <w:numPr>
           <w:ilvl w:val="0"/>
-          <w:numId w:val="13"/>
+          <w:numId w:val="16"/>
         </w:numPr>
         <w:spacing w:after="0" w:afterAutospacing="0" w:lineRule="auto"/>
         <w:ind w:left="720" w:hanging="360"/>
@@ -840,7 +840,7 @@
       <w:pPr>
         <w:numPr>
           <w:ilvl w:val="1"/>
-          <w:numId w:val="13"/>
+          <w:numId w:val="16"/>
         </w:numPr>
         <w:spacing w:after="0" w:afterAutospacing="0" w:lineRule="auto"/>
         <w:ind w:left="1440" w:hanging="360"/>
@@ -878,7 +878,7 @@
       <w:pPr>
         <w:numPr>
           <w:ilvl w:val="1"/>
-          <w:numId w:val="13"/>
+          <w:numId w:val="16"/>
         </w:numPr>
         <w:spacing w:after="0" w:afterAutospacing="0" w:lineRule="auto"/>
         <w:ind w:left="1440" w:hanging="360"/>
@@ -896,7 +896,7 @@
       <w:pPr>
         <w:numPr>
           <w:ilvl w:val="2"/>
-          <w:numId w:val="13"/>
+          <w:numId w:val="16"/>
         </w:numPr>
         <w:spacing w:after="0" w:afterAutospacing="0" w:lineRule="auto"/>
         <w:ind w:left="2160" w:hanging="360"/>
@@ -920,7 +920,7 @@
       <w:pPr>
         <w:numPr>
           <w:ilvl w:val="2"/>
-          <w:numId w:val="13"/>
+          <w:numId w:val="16"/>
         </w:numPr>
         <w:spacing w:after="0" w:afterAutospacing="0" w:lineRule="auto"/>
         <w:ind w:left="2160" w:hanging="360"/>
@@ -944,7 +944,7 @@
       <w:pPr>
         <w:numPr>
           <w:ilvl w:val="1"/>
-          <w:numId w:val="13"/>
+          <w:numId w:val="16"/>
         </w:numPr>
         <w:spacing w:after="0" w:afterAutospacing="0" w:lineRule="auto"/>
         <w:ind w:left="1440" w:hanging="360"/>
@@ -962,7 +962,7 @@
       <w:pPr>
         <w:numPr>
           <w:ilvl w:val="2"/>
-          <w:numId w:val="13"/>
+          <w:numId w:val="16"/>
         </w:numPr>
         <w:spacing w:after="240" w:lineRule="auto"/>
         <w:ind w:left="2160" w:hanging="360"/>
@@ -1014,7 +1014,7 @@
       <w:pPr>
         <w:numPr>
           <w:ilvl w:val="0"/>
-          <w:numId w:val="11"/>
+          <w:numId w:val="14"/>
         </w:numPr>
         <w:spacing w:after="0" w:afterAutospacing="0" w:lineRule="auto"/>
         <w:ind w:left="720" w:hanging="360"/>
@@ -1038,7 +1038,7 @@
       <w:pPr>
         <w:numPr>
           <w:ilvl w:val="0"/>
-          <w:numId w:val="11"/>
+          <w:numId w:val="14"/>
         </w:numPr>
         <w:spacing w:after="0" w:afterAutospacing="0" w:lineRule="auto"/>
         <w:ind w:left="720" w:hanging="360"/>
@@ -1056,7 +1056,7 @@
       <w:pPr>
         <w:numPr>
           <w:ilvl w:val="1"/>
-          <w:numId w:val="11"/>
+          <w:numId w:val="14"/>
         </w:numPr>
         <w:spacing w:after="0" w:afterAutospacing="0" w:lineRule="auto"/>
         <w:ind w:left="1440" w:hanging="360"/>
@@ -1080,7 +1080,7 @@
       <w:pPr>
         <w:numPr>
           <w:ilvl w:val="1"/>
-          <w:numId w:val="11"/>
+          <w:numId w:val="14"/>
         </w:numPr>
         <w:spacing w:after="0" w:afterAutospacing="0" w:lineRule="auto"/>
         <w:ind w:left="1440" w:hanging="360"/>
@@ -1104,7 +1104,7 @@
       <w:pPr>
         <w:numPr>
           <w:ilvl w:val="1"/>
-          <w:numId w:val="11"/>
+          <w:numId w:val="14"/>
         </w:numPr>
         <w:spacing w:after="240" w:lineRule="auto"/>
         <w:ind w:left="1440" w:hanging="360"/>
@@ -1479,7 +1479,7 @@
       <w:pPr>
         <w:numPr>
           <w:ilvl w:val="0"/>
-          <w:numId w:val="7"/>
+          <w:numId w:val="9"/>
         </w:numPr>
         <w:spacing w:after="0" w:afterAutospacing="0" w:lineRule="auto"/>
         <w:ind w:left="720" w:hanging="360"/>
@@ -1503,7 +1503,7 @@
       <w:pPr>
         <w:numPr>
           <w:ilvl w:val="0"/>
-          <w:numId w:val="7"/>
+          <w:numId w:val="9"/>
         </w:numPr>
         <w:spacing w:after="0" w:afterAutospacing="0" w:lineRule="auto"/>
         <w:ind w:left="720" w:hanging="360"/>
@@ -1521,7 +1521,7 @@
       <w:pPr>
         <w:numPr>
           <w:ilvl w:val="1"/>
-          <w:numId w:val="7"/>
+          <w:numId w:val="9"/>
         </w:numPr>
         <w:spacing w:after="0" w:afterAutospacing="0" w:lineRule="auto"/>
         <w:ind w:left="1440" w:hanging="360"/>
@@ -1545,7 +1545,7 @@
       <w:pPr>
         <w:numPr>
           <w:ilvl w:val="1"/>
-          <w:numId w:val="7"/>
+          <w:numId w:val="9"/>
         </w:numPr>
         <w:spacing w:after="0" w:afterAutospacing="0" w:lineRule="auto"/>
         <w:ind w:left="1440" w:hanging="360"/>
@@ -1569,7 +1569,7 @@
       <w:pPr>
         <w:numPr>
           <w:ilvl w:val="1"/>
-          <w:numId w:val="7"/>
+          <w:numId w:val="9"/>
         </w:numPr>
         <w:spacing w:after="0" w:afterAutospacing="0" w:lineRule="auto"/>
         <w:ind w:left="1440" w:hanging="360"/>
@@ -1593,7 +1593,7 @@
       <w:pPr>
         <w:numPr>
           <w:ilvl w:val="1"/>
-          <w:numId w:val="7"/>
+          <w:numId w:val="9"/>
         </w:numPr>
         <w:spacing w:after="0" w:afterAutospacing="0" w:lineRule="auto"/>
         <w:ind w:left="1440" w:hanging="360"/>
@@ -1634,7 +1634,7 @@
       <w:pPr>
         <w:numPr>
           <w:ilvl w:val="1"/>
-          <w:numId w:val="7"/>
+          <w:numId w:val="9"/>
         </w:numPr>
         <w:spacing w:after="240" w:lineRule="auto"/>
         <w:ind w:left="1440" w:hanging="360"/>
@@ -1686,7 +1686,7 @@
       <w:pPr>
         <w:numPr>
           <w:ilvl w:val="0"/>
-          <w:numId w:val="14"/>
+          <w:numId w:val="17"/>
         </w:numPr>
         <w:spacing w:after="0" w:afterAutospacing="0" w:lineRule="auto"/>
         <w:ind w:left="720" w:hanging="360"/>
@@ -1710,7 +1710,7 @@
       <w:pPr>
         <w:numPr>
           <w:ilvl w:val="0"/>
-          <w:numId w:val="14"/>
+          <w:numId w:val="17"/>
         </w:numPr>
         <w:spacing w:after="0" w:afterAutospacing="0" w:lineRule="auto"/>
         <w:ind w:left="720" w:hanging="360"/>
@@ -1728,7 +1728,7 @@
       <w:pPr>
         <w:numPr>
           <w:ilvl w:val="1"/>
-          <w:numId w:val="14"/>
+          <w:numId w:val="17"/>
         </w:numPr>
         <w:spacing w:after="0" w:afterAutospacing="0" w:lineRule="auto"/>
         <w:ind w:left="1440" w:hanging="360"/>
@@ -1752,7 +1752,7 @@
       <w:pPr>
         <w:numPr>
           <w:ilvl w:val="1"/>
-          <w:numId w:val="14"/>
+          <w:numId w:val="17"/>
         </w:numPr>
         <w:spacing w:after="0" w:afterAutospacing="0" w:lineRule="auto"/>
         <w:ind w:left="1440" w:hanging="360"/>
@@ -1776,7 +1776,7 @@
       <w:pPr>
         <w:numPr>
           <w:ilvl w:val="1"/>
-          <w:numId w:val="14"/>
+          <w:numId w:val="17"/>
         </w:numPr>
         <w:spacing w:after="240" w:lineRule="auto"/>
         <w:ind w:left="1440" w:hanging="360"/>
@@ -2035,7 +2035,7 @@
       <w:pPr>
         <w:numPr>
           <w:ilvl w:val="0"/>
-          <w:numId w:val="10"/>
+          <w:numId w:val="13"/>
         </w:numPr>
         <w:spacing w:after="0" w:afterAutospacing="0" w:lineRule="auto"/>
         <w:ind w:left="720" w:hanging="360"/>
@@ -2059,7 +2059,7 @@
       <w:pPr>
         <w:numPr>
           <w:ilvl w:val="0"/>
-          <w:numId w:val="10"/>
+          <w:numId w:val="13"/>
         </w:numPr>
         <w:spacing w:after="0" w:afterAutospacing="0" w:lineRule="auto"/>
         <w:ind w:left="720" w:hanging="360"/>
@@ -2077,7 +2077,7 @@
       <w:pPr>
         <w:numPr>
           <w:ilvl w:val="1"/>
-          <w:numId w:val="10"/>
+          <w:numId w:val="13"/>
         </w:numPr>
         <w:spacing w:after="0" w:afterAutospacing="0" w:lineRule="auto"/>
         <w:ind w:left="1440" w:hanging="360"/>
@@ -2101,7 +2101,7 @@
       <w:pPr>
         <w:numPr>
           <w:ilvl w:val="1"/>
-          <w:numId w:val="10"/>
+          <w:numId w:val="13"/>
         </w:numPr>
         <w:spacing w:after="0" w:afterAutospacing="0" w:lineRule="auto"/>
         <w:ind w:left="1440" w:hanging="360"/>
@@ -2125,7 +2125,7 @@
       <w:pPr>
         <w:numPr>
           <w:ilvl w:val="1"/>
-          <w:numId w:val="10"/>
+          <w:numId w:val="13"/>
         </w:numPr>
         <w:spacing w:after="0" w:afterAutospacing="0" w:lineRule="auto"/>
         <w:ind w:left="1440" w:hanging="360"/>
@@ -2149,7 +2149,7 @@
       <w:pPr>
         <w:numPr>
           <w:ilvl w:val="1"/>
-          <w:numId w:val="10"/>
+          <w:numId w:val="13"/>
         </w:numPr>
         <w:spacing w:after="240" w:lineRule="auto"/>
         <w:ind w:left="1440" w:hanging="360"/>
@@ -2201,7 +2201,7 @@
       <w:pPr>
         <w:numPr>
           <w:ilvl w:val="0"/>
-          <w:numId w:val="15"/>
+          <w:numId w:val="18"/>
         </w:numPr>
         <w:spacing w:after="0" w:afterAutospacing="0" w:lineRule="auto"/>
         <w:ind w:left="720" w:hanging="360"/>
@@ -2225,7 +2225,7 @@
       <w:pPr>
         <w:numPr>
           <w:ilvl w:val="0"/>
-          <w:numId w:val="15"/>
+          <w:numId w:val="18"/>
         </w:numPr>
         <w:spacing w:after="0" w:afterAutospacing="0" w:lineRule="auto"/>
         <w:ind w:left="720" w:hanging="360"/>
@@ -2243,7 +2243,7 @@
       <w:pPr>
         <w:numPr>
           <w:ilvl w:val="1"/>
-          <w:numId w:val="15"/>
+          <w:numId w:val="18"/>
         </w:numPr>
         <w:spacing w:after="0" w:afterAutospacing="0" w:lineRule="auto"/>
         <w:ind w:left="1440" w:hanging="360"/>
@@ -2261,7 +2261,7 @@
       <w:pPr>
         <w:numPr>
           <w:ilvl w:val="2"/>
-          <w:numId w:val="15"/>
+          <w:numId w:val="18"/>
         </w:numPr>
         <w:spacing w:after="0" w:afterAutospacing="0" w:lineRule="auto"/>
         <w:ind w:left="2160" w:hanging="360"/>
@@ -2277,7 +2277,7 @@
       <w:pPr>
         <w:numPr>
           <w:ilvl w:val="2"/>
-          <w:numId w:val="15"/>
+          <w:numId w:val="18"/>
         </w:numPr>
         <w:spacing w:after="0" w:afterAutospacing="0" w:lineRule="auto"/>
         <w:ind w:left="2160" w:hanging="360"/>
@@ -2293,7 +2293,7 @@
       <w:pPr>
         <w:numPr>
           <w:ilvl w:val="2"/>
-          <w:numId w:val="15"/>
+          <w:numId w:val="18"/>
         </w:numPr>
         <w:spacing w:after="0" w:afterAutospacing="0" w:lineRule="auto"/>
         <w:ind w:left="2160" w:hanging="360"/>
@@ -2309,7 +2309,7 @@
       <w:pPr>
         <w:numPr>
           <w:ilvl w:val="2"/>
-          <w:numId w:val="15"/>
+          <w:numId w:val="18"/>
         </w:numPr>
         <w:spacing w:after="0" w:afterAutospacing="0" w:lineRule="auto"/>
         <w:ind w:left="2160" w:hanging="360"/>
@@ -2325,7 +2325,7 @@
       <w:pPr>
         <w:numPr>
           <w:ilvl w:val="2"/>
-          <w:numId w:val="15"/>
+          <w:numId w:val="18"/>
         </w:numPr>
         <w:spacing w:after="0" w:afterAutospacing="0" w:lineRule="auto"/>
         <w:ind w:left="2160" w:hanging="360"/>
@@ -2341,7 +2341,7 @@
       <w:pPr>
         <w:numPr>
           <w:ilvl w:val="2"/>
-          <w:numId w:val="15"/>
+          <w:numId w:val="18"/>
         </w:numPr>
         <w:spacing w:after="0" w:afterAutospacing="0" w:lineRule="auto"/>
         <w:ind w:left="2160" w:hanging="360"/>
@@ -2357,7 +2357,7 @@
       <w:pPr>
         <w:numPr>
           <w:ilvl w:val="1"/>
-          <w:numId w:val="15"/>
+          <w:numId w:val="18"/>
         </w:numPr>
         <w:spacing w:after="0" w:afterAutospacing="0" w:lineRule="auto"/>
         <w:ind w:left="1440" w:hanging="360"/>
@@ -2381,7 +2381,7 @@
       <w:pPr>
         <w:numPr>
           <w:ilvl w:val="1"/>
-          <w:numId w:val="15"/>
+          <w:numId w:val="18"/>
         </w:numPr>
         <w:spacing w:after="240" w:lineRule="auto"/>
         <w:ind w:left="1440" w:hanging="360"/>
@@ -2433,7 +2433,7 @@
       <w:pPr>
         <w:numPr>
           <w:ilvl w:val="0"/>
-          <w:numId w:val="6"/>
+          <w:numId w:val="7"/>
         </w:numPr>
         <w:spacing w:after="0" w:afterAutospacing="0" w:lineRule="auto"/>
         <w:ind w:left="720" w:hanging="360"/>
@@ -2457,7 +2457,7 @@
       <w:pPr>
         <w:numPr>
           <w:ilvl w:val="0"/>
-          <w:numId w:val="6"/>
+          <w:numId w:val="7"/>
         </w:numPr>
         <w:spacing w:after="0" w:afterAutospacing="0" w:lineRule="auto"/>
         <w:ind w:left="720" w:hanging="360"/>
@@ -2475,7 +2475,7 @@
       <w:pPr>
         <w:numPr>
           <w:ilvl w:val="1"/>
-          <w:numId w:val="6"/>
+          <w:numId w:val="7"/>
         </w:numPr>
         <w:spacing w:after="0" w:afterAutospacing="0" w:lineRule="auto"/>
         <w:ind w:left="1440" w:hanging="360"/>
@@ -2499,7 +2499,7 @@
       <w:pPr>
         <w:numPr>
           <w:ilvl w:val="1"/>
-          <w:numId w:val="6"/>
+          <w:numId w:val="7"/>
         </w:numPr>
         <w:spacing w:after="0" w:afterAutospacing="0" w:lineRule="auto"/>
         <w:ind w:left="1440" w:hanging="360"/>
@@ -2523,7 +2523,7 @@
       <w:pPr>
         <w:numPr>
           <w:ilvl w:val="1"/>
-          <w:numId w:val="6"/>
+          <w:numId w:val="7"/>
         </w:numPr>
         <w:spacing w:after="0" w:afterAutospacing="0" w:lineRule="auto"/>
         <w:ind w:left="1440" w:hanging="360"/>
@@ -2547,7 +2547,7 @@
       <w:pPr>
         <w:numPr>
           <w:ilvl w:val="1"/>
-          <w:numId w:val="6"/>
+          <w:numId w:val="7"/>
         </w:numPr>
         <w:spacing w:after="240" w:lineRule="auto"/>
         <w:ind w:left="1440" w:hanging="360"/>
@@ -2707,6 +2707,449 @@
           <w:rtl w:val="0"/>
         </w:rPr>
         <w:t xml:space="preserve"> Incineration, shredding, pulverizing, or drilling holes through platters/chips to guarantee zero recovery.</w:t>
+      </w:r>
+    </w:p>
+    <w:p>
+      <w:pPr>
+        <w:rPr/>
+      </w:pPr>
+      <w:r>
+        <w:rPr>
+          <w:rtl w:val="0"/>
+        </w:rPr>
+        <w:t xml:space="preserve">⚡ Quick Tab-Separated Flashcard List (Ready for Anki/Quizlet Import) </w:t>
+      </w:r>
+    </w:p>
+    <w:p>
+      <w:pPr>
+        <w:rPr/>
+      </w:pPr>
+      <w:r>
+        <w:rPr>
+          <w:rtl w:val="0"/>
+        </w:rPr>
+      </w:r>
+    </w:p>
+    <w:p>
+      <w:pPr>
+        <w:pStyle w:val="Heading3"/>
+        <w:spacing w:before="0" w:lineRule="auto"/>
+        <w:rPr/>
+      </w:pPr>
+      <w:bookmarkStart w:colFirst="0" w:colLast="0" w:name="_7j3fovtsneqd" w:id="19"/>
+      <w:bookmarkEnd w:id="19"/>
+      <w:r>
+        <w:rPr>
+          <w:b w:val="1"/>
+          <w:bCs w:val="1"/>
+          <w:color w:val="000000"/>
+          <w:sz w:val="26"/>
+          <w:szCs w:val="26"/>
+          <w:rtl w:val="0"/>
+        </w:rPr>
+        <w:t xml:space="preserve">Control Implementation Strategies</w:t>
+      </w:r>
+      <w:r>
+        <w:rPr>
+          <w:rtl w:val="0"/>
+        </w:rPr>
+      </w:r>
+    </w:p>
+    <w:p>
+      <w:pPr>
+        <w:numPr>
+          <w:ilvl w:val="0"/>
+          <w:numId w:val="19"/>
+        </w:numPr>
+        <w:ind w:left="720" w:hanging="360"/>
+      </w:pPr>
+      <w:r>
+        <w:rPr>
+          <w:b w:val="1"/>
+          <w:bCs w:val="1"/>
+          <w:rtl w:val="0"/>
+        </w:rPr>
+        <w:t xml:space="preserve">Compensating Control: </w:t>
+      </w:r>
+      <w:r>
+        <w:rPr>
+          <w:rtl w:val="0"/>
+        </w:rPr>
+        <w:t xml:space="preserve">A substitute security measure put in place when standard controls are impractical or cannot be deployed.</w:t>
+      </w:r>
+    </w:p>
+    <w:p>
+      <w:pPr>
+        <w:numPr>
+          <w:ilvl w:val="0"/>
+          <w:numId w:val="19"/>
+        </w:numPr>
+        <w:ind w:left="720" w:hanging="360"/>
+      </w:pPr>
+      <w:r>
+        <w:rPr>
+          <w:b w:val="1"/>
+          <w:bCs w:val="1"/>
+          <w:rtl w:val="0"/>
+        </w:rPr>
+        <w:t xml:space="preserve">Directive Control: </w:t>
+      </w:r>
+      <w:r>
+        <w:rPr>
+          <w:rtl w:val="0"/>
+        </w:rPr>
+        <w:t xml:space="preserve">Requirements established through organizational policies, legal statutes, or regulatory guidelines to dictate compliant behavior.</w:t>
+      </w:r>
+    </w:p>
+    <w:p>
+      <w:pPr>
+        <w:pStyle w:val="Heading3"/>
+        <w:spacing w:before="240" w:lineRule="auto"/>
+        <w:rPr/>
+      </w:pPr>
+      <w:bookmarkStart w:colFirst="0" w:colLast="0" w:name="_ss82rcbijsme" w:id="20"/>
+      <w:bookmarkEnd w:id="20"/>
+      <w:r>
+        <w:rPr>
+          <w:b w:val="1"/>
+          <w:bCs w:val="1"/>
+          <w:color w:val="000000"/>
+          <w:sz w:val="26"/>
+          <w:szCs w:val="26"/>
+          <w:rtl w:val="0"/>
+        </w:rPr>
+        <w:t xml:space="preserve">Data States &amp; Protection Techniques</w:t>
+      </w:r>
+      <w:r>
+        <w:rPr>
+          <w:rtl w:val="0"/>
+        </w:rPr>
+      </w:r>
+    </w:p>
+    <w:p>
+      <w:pPr>
+        <w:numPr>
+          <w:ilvl w:val="0"/>
+          <w:numId w:val="6"/>
+        </w:numPr>
+        <w:ind w:left="720" w:hanging="360"/>
+      </w:pPr>
+      <w:r>
+        <w:rPr>
+          <w:b w:val="1"/>
+          <w:bCs w:val="1"/>
+          <w:rtl w:val="0"/>
+        </w:rPr>
+        <w:t xml:space="preserve">Data at Rest: </w:t>
+      </w:r>
+      <w:r>
+        <w:rPr>
+          <w:rtl w:val="0"/>
+        </w:rPr>
+        <w:t xml:space="preserve">Inactive information saved on storage devices (SSDs, HDDs, USB drives, backup tapes); secured using FDE or AES-256 encryption.</w:t>
+      </w:r>
+    </w:p>
+    <w:p>
+      <w:pPr>
+        <w:numPr>
+          <w:ilvl w:val="0"/>
+          <w:numId w:val="6"/>
+        </w:numPr>
+        <w:ind w:left="720" w:hanging="360"/>
+      </w:pPr>
+      <w:r>
+        <w:rPr>
+          <w:b w:val="1"/>
+          <w:bCs w:val="1"/>
+          <w:rtl w:val="0"/>
+        </w:rPr>
+        <w:t xml:space="preserve">Data in Transit: </w:t>
+      </w:r>
+      <w:r>
+        <w:rPr>
+          <w:rtl w:val="0"/>
+        </w:rPr>
+        <w:t xml:space="preserve">Network traffic actively traversing communication links; safeguarded using IPsec tunnels and TLS.</w:t>
+      </w:r>
+    </w:p>
+    <w:p>
+      <w:pPr>
+        <w:numPr>
+          <w:ilvl w:val="0"/>
+          <w:numId w:val="6"/>
+        </w:numPr>
+        <w:ind w:left="720" w:hanging="360"/>
+      </w:pPr>
+      <w:r>
+        <w:rPr>
+          <w:b w:val="1"/>
+          <w:bCs w:val="1"/>
+          <w:rtl w:val="0"/>
+        </w:rPr>
+        <w:t xml:space="preserve">Data in Use: </w:t>
+      </w:r>
+      <w:r>
+        <w:rPr>
+          <w:rtl w:val="0"/>
+        </w:rPr>
+        <w:t xml:space="preserve">Active data residing in processor registers or system RAM; shielded via Secure Enclaves.</w:t>
+      </w:r>
+    </w:p>
+    <w:p>
+      <w:pPr>
+        <w:numPr>
+          <w:ilvl w:val="0"/>
+          <w:numId w:val="6"/>
+        </w:numPr>
+        <w:ind w:left="720" w:hanging="360"/>
+      </w:pPr>
+      <w:r>
+        <w:rPr>
+          <w:b w:val="1"/>
+          <w:bCs w:val="1"/>
+          <w:rtl w:val="0"/>
+        </w:rPr>
+        <w:t xml:space="preserve">Data Masking: </w:t>
+      </w:r>
+      <w:r>
+        <w:rPr>
+          <w:rtl w:val="0"/>
+        </w:rPr>
+        <w:t xml:space="preserve">Obfuscating sensitive text characters (e.g., **** 1234) for secure viewing or software testing.</w:t>
+      </w:r>
+    </w:p>
+    <w:p>
+      <w:pPr>
+        <w:numPr>
+          <w:ilvl w:val="0"/>
+          <w:numId w:val="6"/>
+        </w:numPr>
+        <w:ind w:left="720" w:hanging="360"/>
+      </w:pPr>
+      <w:r>
+        <w:rPr>
+          <w:b w:val="1"/>
+          <w:bCs w:val="1"/>
+          <w:rtl w:val="0"/>
+        </w:rPr>
+        <w:t xml:space="preserve">Tokenization: </w:t>
+      </w:r>
+      <w:r>
+        <w:rPr>
+          <w:rtl w:val="0"/>
+        </w:rPr>
+        <w:t xml:space="preserve">Swapping sensitive data values with non-sensitive surrogate tokens.</w:t>
+      </w:r>
+    </w:p>
+    <w:p>
+      <w:pPr>
+        <w:numPr>
+          <w:ilvl w:val="0"/>
+          <w:numId w:val="6"/>
+        </w:numPr>
+        <w:ind w:left="720" w:hanging="360"/>
+      </w:pPr>
+      <w:r>
+        <w:rPr>
+          <w:b w:val="1"/>
+          <w:bCs w:val="1"/>
+          <w:rtl w:val="0"/>
+        </w:rPr>
+        <w:t xml:space="preserve">Steganography: </w:t>
+      </w:r>
+      <w:r>
+        <w:rPr>
+          <w:rtl w:val="0"/>
+        </w:rPr>
+        <w:t xml:space="preserve">Hiding hidden payloads or data within carrier files, such as JPG images.</w:t>
+      </w:r>
+    </w:p>
+    <w:p>
+      <w:pPr>
+        <w:pStyle w:val="Heading3"/>
+        <w:spacing w:before="240" w:lineRule="auto"/>
+        <w:rPr/>
+      </w:pPr>
+      <w:bookmarkStart w:colFirst="0" w:colLast="0" w:name="_iissli316u6" w:id="21"/>
+      <w:bookmarkEnd w:id="21"/>
+      <w:r>
+        <w:rPr>
+          <w:b w:val="1"/>
+          <w:bCs w:val="1"/>
+          <w:color w:val="000000"/>
+          <w:sz w:val="26"/>
+          <w:szCs w:val="26"/>
+          <w:rtl w:val="0"/>
+        </w:rPr>
+        <w:t xml:space="preserve">Email Authentication Standards</w:t>
+      </w:r>
+      <w:r>
+        <w:rPr>
+          <w:rtl w:val="0"/>
+        </w:rPr>
+      </w:r>
+    </w:p>
+    <w:p>
+      <w:pPr>
+        <w:numPr>
+          <w:ilvl w:val="0"/>
+          <w:numId w:val="8"/>
+        </w:numPr>
+        <w:ind w:left="720" w:hanging="360"/>
+      </w:pPr>
+      <w:r>
+        <w:rPr>
+          <w:b w:val="1"/>
+          <w:bCs w:val="1"/>
+          <w:rtl w:val="0"/>
+        </w:rPr>
+        <w:t xml:space="preserve">SPF (Sender Policy Framework): </w:t>
+      </w:r>
+      <w:r>
+        <w:rPr>
+          <w:rtl w:val="0"/>
+        </w:rPr>
+        <w:t xml:space="preserve">A DNS TXT record specifying IP addresses authorized to send emails on behalf of a domain.</w:t>
+      </w:r>
+    </w:p>
+    <w:p>
+      <w:pPr>
+        <w:numPr>
+          <w:ilvl w:val="0"/>
+          <w:numId w:val="8"/>
+        </w:numPr>
+        <w:ind w:left="720" w:hanging="360"/>
+      </w:pPr>
+      <w:r>
+        <w:rPr>
+          <w:b w:val="1"/>
+          <w:bCs w:val="1"/>
+          <w:rtl w:val="0"/>
+        </w:rPr>
+        <w:t xml:space="preserve">DKIM (DomainKeys Identified Mail): </w:t>
+      </w:r>
+      <w:r>
+        <w:rPr>
+          <w:rtl w:val="0"/>
+        </w:rPr>
+        <w:t xml:space="preserve">Uses cryptographic signatures on email headers to verify message integrity in transit.</w:t>
+      </w:r>
+    </w:p>
+    <w:p>
+      <w:pPr>
+        <w:numPr>
+          <w:ilvl w:val="0"/>
+          <w:numId w:val="8"/>
+        </w:numPr>
+        <w:ind w:left="720" w:hanging="360"/>
+      </w:pPr>
+      <w:r>
+        <w:rPr>
+          <w:b w:val="1"/>
+          <w:bCs w:val="1"/>
+          <w:rtl w:val="0"/>
+        </w:rPr>
+        <w:t xml:space="preserve">DMARC: </w:t>
+      </w:r>
+      <w:r>
+        <w:rPr>
+          <w:rtl w:val="0"/>
+        </w:rPr>
+        <w:t xml:space="preserve">Leverages SPF and DKIM checks to define enforcement actions (none, quarantine, or reject) for non-compliant emails.</w:t>
+      </w:r>
+    </w:p>
+    <w:p>
+      <w:pPr>
+        <w:pStyle w:val="Heading3"/>
+        <w:spacing w:before="240" w:lineRule="auto"/>
+        <w:rPr/>
+      </w:pPr>
+      <w:bookmarkStart w:colFirst="0" w:colLast="0" w:name="_krlsciekjioo" w:id="22"/>
+      <w:bookmarkEnd w:id="22"/>
+      <w:r>
+        <w:rPr>
+          <w:b w:val="1"/>
+          <w:bCs w:val="1"/>
+          <w:color w:val="000000"/>
+          <w:sz w:val="26"/>
+          <w:szCs w:val="26"/>
+          <w:rtl w:val="0"/>
+        </w:rPr>
+        <w:t xml:space="preserve">Digital Forensics &amp; Evidence Handling</w:t>
+      </w:r>
+      <w:r>
+        <w:rPr>
+          <w:rtl w:val="0"/>
+        </w:rPr>
+      </w:r>
+    </w:p>
+    <w:p>
+      <w:pPr>
+        <w:numPr>
+          <w:ilvl w:val="0"/>
+          <w:numId w:val="10"/>
+        </w:numPr>
+        <w:ind w:left="720" w:hanging="360"/>
+      </w:pPr>
+      <w:r>
+        <w:rPr>
+          <w:b w:val="1"/>
+          <w:bCs w:val="1"/>
+          <w:rtl w:val="0"/>
+        </w:rPr>
+        <w:t xml:space="preserve">Legal Hold: </w:t>
+      </w:r>
+      <w:r>
+        <w:rPr>
+          <w:rtl w:val="0"/>
+        </w:rPr>
+        <w:t xml:space="preserve">A mandate to safeguard all potential digital evidence by halting routine data destruction schedules.</w:t>
+      </w:r>
+    </w:p>
+    <w:p>
+      <w:pPr>
+        <w:numPr>
+          <w:ilvl w:val="0"/>
+          <w:numId w:val="10"/>
+        </w:numPr>
+        <w:ind w:left="720" w:hanging="360"/>
+      </w:pPr>
+      <w:r>
+        <w:rPr>
+          <w:b w:val="1"/>
+          <w:bCs w:val="1"/>
+          <w:rtl w:val="0"/>
+        </w:rPr>
+        <w:t xml:space="preserve">Chain of Custody: </w:t>
+      </w:r>
+      <w:r>
+        <w:rPr>
+          <w:rtl w:val="0"/>
+        </w:rPr>
+        <w:t xml:space="preserve">Sequential record-keeping that verifies the transfer, custody, and integrity of collected evidence.</w:t>
+      </w:r>
+    </w:p>
+    <w:p>
+      <w:pPr>
+        <w:numPr>
+          <w:ilvl w:val="0"/>
+          <w:numId w:val="10"/>
+        </w:numPr>
+        <w:ind w:left="720" w:hanging="360"/>
+      </w:pPr>
+      <w:r>
+        <w:rPr>
+          <w:b w:val="1"/>
+          <w:bCs w:val="1"/>
+          <w:rtl w:val="0"/>
+        </w:rPr>
+        <w:t xml:space="preserve">Order of Volatility: </w:t>
+      </w:r>
+      <w:r>
+        <w:rPr>
+          <w:rtl w:val="0"/>
+        </w:rPr>
+        <w:t xml:space="preserve">Sequence of data lifespan prior to preservation: CPU Cache/Registers -&gt; System RAM -&gt; Swap/Temp Files -&gt; Storage Drives -&gt; Remote Network Logs -&gt; Archival Backup Tapes.</w:t>
       </w:r>
     </w:p>
     <w:p>
@@ -3299,10 +3742,7 @@
       <w:pPr>
         <w:ind w:left="720" w:hanging="360"/>
       </w:pPr>
-      <w:rPr>
-        <w:rFonts w:ascii="Arial" w:cs="Arial" w:eastAsia="Arial" w:hAnsi="Arial"/>
-        <w:u w:val="none"/>
-      </w:rPr>
+      <w:rPr/>
     </w:lvl>
     <w:lvl w:ilvl="1">
       <w:start w:val="1"/>
@@ -3312,10 +3752,7 @@
       <w:pPr>
         <w:ind w:left="1440" w:hanging="360"/>
       </w:pPr>
-      <w:rPr>
-        <w:rFonts w:ascii="Arial" w:cs="Arial" w:eastAsia="Arial" w:hAnsi="Arial"/>
-        <w:u w:val="none"/>
-      </w:rPr>
+      <w:rPr/>
     </w:lvl>
     <w:lvl w:ilvl="2">
       <w:start w:val="1"/>
@@ -3325,9 +3762,7 @@
       <w:pPr>
         <w:ind w:left="2160" w:hanging="360"/>
       </w:pPr>
-      <w:rPr>
-        <w:u w:val="none"/>
-      </w:rPr>
+      <w:rPr/>
     </w:lvl>
     <w:lvl w:ilvl="3">
       <w:start w:val="1"/>
@@ -3337,9 +3772,7 @@
       <w:pPr>
         <w:ind w:left="2880" w:hanging="360"/>
       </w:pPr>
-      <w:rPr>
-        <w:u w:val="none"/>
-      </w:rPr>
+      <w:rPr/>
     </w:lvl>
     <w:lvl w:ilvl="4">
       <w:start w:val="1"/>
@@ -3349,9 +3782,7 @@
       <w:pPr>
         <w:ind w:left="3600" w:hanging="360"/>
       </w:pPr>
-      <w:rPr>
-        <w:u w:val="none"/>
-      </w:rPr>
+      <w:rPr/>
     </w:lvl>
     <w:lvl w:ilvl="5">
       <w:start w:val="1"/>
@@ -3361,9 +3792,7 @@
       <w:pPr>
         <w:ind w:left="4320" w:hanging="360"/>
       </w:pPr>
-      <w:rPr>
-        <w:u w:val="none"/>
-      </w:rPr>
+      <w:rPr/>
     </w:lvl>
     <w:lvl w:ilvl="6">
       <w:start w:val="1"/>
@@ -3373,9 +3802,7 @@
       <w:pPr>
         <w:ind w:left="5040" w:hanging="360"/>
       </w:pPr>
-      <w:rPr>
-        <w:u w:val="none"/>
-      </w:rPr>
+      <w:rPr/>
     </w:lvl>
     <w:lvl w:ilvl="7">
       <w:start w:val="1"/>
@@ -3385,9 +3812,7 @@
       <w:pPr>
         <w:ind w:left="5760" w:hanging="360"/>
       </w:pPr>
-      <w:rPr>
-        <w:u w:val="none"/>
-      </w:rPr>
+      <w:rPr/>
     </w:lvl>
     <w:lvl w:ilvl="8">
       <w:start w:val="1"/>
@@ -3397,9 +3822,7 @@
       <w:pPr>
         <w:ind w:left="6480" w:hanging="360"/>
       </w:pPr>
-      <w:rPr>
-        <w:u w:val="none"/>
-      </w:rPr>
+      <w:rPr/>
     </w:lvl>
   </w:abstractNum>
   <w:abstractNum w:abstractNumId="7">
@@ -3523,10 +3946,7 @@
       <w:pPr>
         <w:ind w:left="720" w:hanging="360"/>
       </w:pPr>
-      <w:rPr>
-        <w:rFonts w:ascii="Arial" w:cs="Arial" w:eastAsia="Arial" w:hAnsi="Arial"/>
-        <w:u w:val="none"/>
-      </w:rPr>
+      <w:rPr/>
     </w:lvl>
     <w:lvl w:ilvl="1">
       <w:start w:val="1"/>
@@ -3536,10 +3956,7 @@
       <w:pPr>
         <w:ind w:left="1440" w:hanging="360"/>
       </w:pPr>
-      <w:rPr>
-        <w:rFonts w:ascii="Arial" w:cs="Arial" w:eastAsia="Arial" w:hAnsi="Arial"/>
-        <w:u w:val="none"/>
-      </w:rPr>
+      <w:rPr/>
     </w:lvl>
     <w:lvl w:ilvl="2">
       <w:start w:val="1"/>
@@ -3549,9 +3966,7 @@
       <w:pPr>
         <w:ind w:left="2160" w:hanging="360"/>
       </w:pPr>
-      <w:rPr>
-        <w:u w:val="none"/>
-      </w:rPr>
+      <w:rPr/>
     </w:lvl>
     <w:lvl w:ilvl="3">
       <w:start w:val="1"/>
@@ -3561,9 +3976,7 @@
       <w:pPr>
         <w:ind w:left="2880" w:hanging="360"/>
       </w:pPr>
-      <w:rPr>
-        <w:u w:val="none"/>
-      </w:rPr>
+      <w:rPr/>
     </w:lvl>
     <w:lvl w:ilvl="4">
       <w:start w:val="1"/>
@@ -3573,9 +3986,7 @@
       <w:pPr>
         <w:ind w:left="3600" w:hanging="360"/>
       </w:pPr>
-      <w:rPr>
-        <w:u w:val="none"/>
-      </w:rPr>
+      <w:rPr/>
     </w:lvl>
     <w:lvl w:ilvl="5">
       <w:start w:val="1"/>
@@ -3585,9 +3996,7 @@
       <w:pPr>
         <w:ind w:left="4320" w:hanging="360"/>
       </w:pPr>
-      <w:rPr>
-        <w:u w:val="none"/>
-      </w:rPr>
+      <w:rPr/>
     </w:lvl>
     <w:lvl w:ilvl="6">
       <w:start w:val="1"/>
@@ -3597,9 +4006,7 @@
       <w:pPr>
         <w:ind w:left="5040" w:hanging="360"/>
       </w:pPr>
-      <w:rPr>
-        <w:u w:val="none"/>
-      </w:rPr>
+      <w:rPr/>
     </w:lvl>
     <w:lvl w:ilvl="7">
       <w:start w:val="1"/>
@@ -3609,9 +4016,7 @@
       <w:pPr>
         <w:ind w:left="5760" w:hanging="360"/>
       </w:pPr>
-      <w:rPr>
-        <w:u w:val="none"/>
-      </w:rPr>
+      <w:rPr/>
     </w:lvl>
     <w:lvl w:ilvl="8">
       <w:start w:val="1"/>
@@ -3621,9 +4026,7 @@
       <w:pPr>
         <w:ind w:left="6480" w:hanging="360"/>
       </w:pPr>
-      <w:rPr>
-        <w:u w:val="none"/>
-      </w:rPr>
+      <w:rPr/>
     </w:lvl>
   </w:abstractNum>
   <w:abstractNum w:abstractNumId="9">
@@ -3747,10 +4150,7 @@
       <w:pPr>
         <w:ind w:left="720" w:hanging="360"/>
       </w:pPr>
-      <w:rPr>
-        <w:rFonts w:ascii="Arial" w:cs="Arial" w:eastAsia="Arial" w:hAnsi="Arial"/>
-        <w:u w:val="none"/>
-      </w:rPr>
+      <w:rPr/>
     </w:lvl>
     <w:lvl w:ilvl="1">
       <w:start w:val="1"/>
@@ -3760,10 +4160,7 @@
       <w:pPr>
         <w:ind w:left="1440" w:hanging="360"/>
       </w:pPr>
-      <w:rPr>
-        <w:rFonts w:ascii="Arial" w:cs="Arial" w:eastAsia="Arial" w:hAnsi="Arial"/>
-        <w:u w:val="none"/>
-      </w:rPr>
+      <w:rPr/>
     </w:lvl>
     <w:lvl w:ilvl="2">
       <w:start w:val="1"/>
@@ -3773,9 +4170,7 @@
       <w:pPr>
         <w:ind w:left="2160" w:hanging="360"/>
       </w:pPr>
-      <w:rPr>
-        <w:u w:val="none"/>
-      </w:rPr>
+      <w:rPr/>
     </w:lvl>
     <w:lvl w:ilvl="3">
       <w:start w:val="1"/>
@@ -3785,9 +4180,7 @@
       <w:pPr>
         <w:ind w:left="2880" w:hanging="360"/>
       </w:pPr>
-      <w:rPr>
-        <w:u w:val="none"/>
-      </w:rPr>
+      <w:rPr/>
     </w:lvl>
     <w:lvl w:ilvl="4">
       <w:start w:val="1"/>
@@ -3797,9 +4190,7 @@
       <w:pPr>
         <w:ind w:left="3600" w:hanging="360"/>
       </w:pPr>
-      <w:rPr>
-        <w:u w:val="none"/>
-      </w:rPr>
+      <w:rPr/>
     </w:lvl>
     <w:lvl w:ilvl="5">
       <w:start w:val="1"/>
@@ -3809,9 +4200,7 @@
       <w:pPr>
         <w:ind w:left="4320" w:hanging="360"/>
       </w:pPr>
-      <w:rPr>
-        <w:u w:val="none"/>
-      </w:rPr>
+      <w:rPr/>
     </w:lvl>
     <w:lvl w:ilvl="6">
       <w:start w:val="1"/>
@@ -3821,9 +4210,7 @@
       <w:pPr>
         <w:ind w:left="5040" w:hanging="360"/>
       </w:pPr>
-      <w:rPr>
-        <w:u w:val="none"/>
-      </w:rPr>
+      <w:rPr/>
     </w:lvl>
     <w:lvl w:ilvl="7">
       <w:start w:val="1"/>
@@ -3833,9 +4220,7 @@
       <w:pPr>
         <w:ind w:left="5760" w:hanging="360"/>
       </w:pPr>
-      <w:rPr>
-        <w:u w:val="none"/>
-      </w:rPr>
+      <w:rPr/>
     </w:lvl>
     <w:lvl w:ilvl="8">
       <w:start w:val="1"/>
@@ -3845,9 +4230,7 @@
       <w:pPr>
         <w:ind w:left="6480" w:hanging="360"/>
       </w:pPr>
-      <w:rPr>
-        <w:u w:val="none"/>
-      </w:rPr>
+      <w:rPr/>
     </w:lvl>
   </w:abstractNum>
   <w:abstractNum w:abstractNumId="11">
@@ -4110,7 +4493,6 @@
         <w:ind w:left="2160" w:hanging="360"/>
       </w:pPr>
       <w:rPr>
-        <w:rFonts w:ascii="Arial" w:cs="Arial" w:eastAsia="Arial" w:hAnsi="Arial"/>
         <w:u w:val="none"/>
       </w:rPr>
     </w:lvl>
@@ -4328,6 +4710,343 @@
     </w:lvl>
     <w:lvl w:ilvl="2">
       <w:start w:val="1"/>
+      <w:numFmt w:val="bullet"/>
+      <w:lvlText w:val="■"/>
+      <w:lvlJc w:val="left"/>
+      <w:pPr>
+        <w:ind w:left="2160" w:hanging="360"/>
+      </w:pPr>
+      <w:rPr>
+        <w:u w:val="none"/>
+      </w:rPr>
+    </w:lvl>
+    <w:lvl w:ilvl="3">
+      <w:start w:val="1"/>
+      <w:numFmt w:val="bullet"/>
+      <w:lvlText w:val="●"/>
+      <w:lvlJc w:val="left"/>
+      <w:pPr>
+        <w:ind w:left="2880" w:hanging="360"/>
+      </w:pPr>
+      <w:rPr>
+        <w:u w:val="none"/>
+      </w:rPr>
+    </w:lvl>
+    <w:lvl w:ilvl="4">
+      <w:start w:val="1"/>
+      <w:numFmt w:val="bullet"/>
+      <w:lvlText w:val="○"/>
+      <w:lvlJc w:val="left"/>
+      <w:pPr>
+        <w:ind w:left="3600" w:hanging="360"/>
+      </w:pPr>
+      <w:rPr>
+        <w:u w:val="none"/>
+      </w:rPr>
+    </w:lvl>
+    <w:lvl w:ilvl="5">
+      <w:start w:val="1"/>
+      <w:numFmt w:val="bullet"/>
+      <w:lvlText w:val="■"/>
+      <w:lvlJc w:val="left"/>
+      <w:pPr>
+        <w:ind w:left="4320" w:hanging="360"/>
+      </w:pPr>
+      <w:rPr>
+        <w:u w:val="none"/>
+      </w:rPr>
+    </w:lvl>
+    <w:lvl w:ilvl="6">
+      <w:start w:val="1"/>
+      <w:numFmt w:val="bullet"/>
+      <w:lvlText w:val="●"/>
+      <w:lvlJc w:val="left"/>
+      <w:pPr>
+        <w:ind w:left="5040" w:hanging="360"/>
+      </w:pPr>
+      <w:rPr>
+        <w:u w:val="none"/>
+      </w:rPr>
+    </w:lvl>
+    <w:lvl w:ilvl="7">
+      <w:start w:val="1"/>
+      <w:numFmt w:val="bullet"/>
+      <w:lvlText w:val="○"/>
+      <w:lvlJc w:val="left"/>
+      <w:pPr>
+        <w:ind w:left="5760" w:hanging="360"/>
+      </w:pPr>
+      <w:rPr>
+        <w:u w:val="none"/>
+      </w:rPr>
+    </w:lvl>
+    <w:lvl w:ilvl="8">
+      <w:start w:val="1"/>
+      <w:numFmt w:val="bullet"/>
+      <w:lvlText w:val="■"/>
+      <w:lvlJc w:val="left"/>
+      <w:pPr>
+        <w:ind w:left="6480" w:hanging="360"/>
+      </w:pPr>
+      <w:rPr>
+        <w:u w:val="none"/>
+      </w:rPr>
+    </w:lvl>
+  </w:abstractNum>
+  <w:abstractNum w:abstractNumId="16">
+    <w:lvl w:ilvl="0">
+      <w:start w:val="1"/>
+      <w:numFmt w:val="bullet"/>
+      <w:lvlText w:val="●"/>
+      <w:lvlJc w:val="left"/>
+      <w:pPr>
+        <w:ind w:left="720" w:hanging="360"/>
+      </w:pPr>
+      <w:rPr>
+        <w:rFonts w:ascii="Arial" w:cs="Arial" w:eastAsia="Arial" w:hAnsi="Arial"/>
+        <w:u w:val="none"/>
+      </w:rPr>
+    </w:lvl>
+    <w:lvl w:ilvl="1">
+      <w:start w:val="1"/>
+      <w:numFmt w:val="bullet"/>
+      <w:lvlText w:val="○"/>
+      <w:lvlJc w:val="left"/>
+      <w:pPr>
+        <w:ind w:left="1440" w:hanging="360"/>
+      </w:pPr>
+      <w:rPr>
+        <w:rFonts w:ascii="Arial" w:cs="Arial" w:eastAsia="Arial" w:hAnsi="Arial"/>
+        <w:u w:val="none"/>
+      </w:rPr>
+    </w:lvl>
+    <w:lvl w:ilvl="2">
+      <w:start w:val="1"/>
+      <w:numFmt w:val="bullet"/>
+      <w:lvlText w:val="■"/>
+      <w:lvlJc w:val="left"/>
+      <w:pPr>
+        <w:ind w:left="2160" w:hanging="360"/>
+      </w:pPr>
+      <w:rPr>
+        <w:rFonts w:ascii="Arial" w:cs="Arial" w:eastAsia="Arial" w:hAnsi="Arial"/>
+        <w:u w:val="none"/>
+      </w:rPr>
+    </w:lvl>
+    <w:lvl w:ilvl="3">
+      <w:start w:val="1"/>
+      <w:numFmt w:val="bullet"/>
+      <w:lvlText w:val="●"/>
+      <w:lvlJc w:val="left"/>
+      <w:pPr>
+        <w:ind w:left="2880" w:hanging="360"/>
+      </w:pPr>
+      <w:rPr>
+        <w:u w:val="none"/>
+      </w:rPr>
+    </w:lvl>
+    <w:lvl w:ilvl="4">
+      <w:start w:val="1"/>
+      <w:numFmt w:val="bullet"/>
+      <w:lvlText w:val="○"/>
+      <w:lvlJc w:val="left"/>
+      <w:pPr>
+        <w:ind w:left="3600" w:hanging="360"/>
+      </w:pPr>
+      <w:rPr>
+        <w:u w:val="none"/>
+      </w:rPr>
+    </w:lvl>
+    <w:lvl w:ilvl="5">
+      <w:start w:val="1"/>
+      <w:numFmt w:val="bullet"/>
+      <w:lvlText w:val="■"/>
+      <w:lvlJc w:val="left"/>
+      <w:pPr>
+        <w:ind w:left="4320" w:hanging="360"/>
+      </w:pPr>
+      <w:rPr>
+        <w:u w:val="none"/>
+      </w:rPr>
+    </w:lvl>
+    <w:lvl w:ilvl="6">
+      <w:start w:val="1"/>
+      <w:numFmt w:val="bullet"/>
+      <w:lvlText w:val="●"/>
+      <w:lvlJc w:val="left"/>
+      <w:pPr>
+        <w:ind w:left="5040" w:hanging="360"/>
+      </w:pPr>
+      <w:rPr>
+        <w:u w:val="none"/>
+      </w:rPr>
+    </w:lvl>
+    <w:lvl w:ilvl="7">
+      <w:start w:val="1"/>
+      <w:numFmt w:val="bullet"/>
+      <w:lvlText w:val="○"/>
+      <w:lvlJc w:val="left"/>
+      <w:pPr>
+        <w:ind w:left="5760" w:hanging="360"/>
+      </w:pPr>
+      <w:rPr>
+        <w:u w:val="none"/>
+      </w:rPr>
+    </w:lvl>
+    <w:lvl w:ilvl="8">
+      <w:start w:val="1"/>
+      <w:numFmt w:val="bullet"/>
+      <w:lvlText w:val="■"/>
+      <w:lvlJc w:val="left"/>
+      <w:pPr>
+        <w:ind w:left="6480" w:hanging="360"/>
+      </w:pPr>
+      <w:rPr>
+        <w:u w:val="none"/>
+      </w:rPr>
+    </w:lvl>
+  </w:abstractNum>
+  <w:abstractNum w:abstractNumId="17">
+    <w:lvl w:ilvl="0">
+      <w:start w:val="1"/>
+      <w:numFmt w:val="bullet"/>
+      <w:lvlText w:val="●"/>
+      <w:lvlJc w:val="left"/>
+      <w:pPr>
+        <w:ind w:left="720" w:hanging="360"/>
+      </w:pPr>
+      <w:rPr>
+        <w:rFonts w:ascii="Arial" w:cs="Arial" w:eastAsia="Arial" w:hAnsi="Arial"/>
+        <w:u w:val="none"/>
+      </w:rPr>
+    </w:lvl>
+    <w:lvl w:ilvl="1">
+      <w:start w:val="1"/>
+      <w:numFmt w:val="bullet"/>
+      <w:lvlText w:val="○"/>
+      <w:lvlJc w:val="left"/>
+      <w:pPr>
+        <w:ind w:left="1440" w:hanging="360"/>
+      </w:pPr>
+      <w:rPr>
+        <w:rFonts w:ascii="Arial" w:cs="Arial" w:eastAsia="Arial" w:hAnsi="Arial"/>
+        <w:u w:val="none"/>
+      </w:rPr>
+    </w:lvl>
+    <w:lvl w:ilvl="2">
+      <w:start w:val="1"/>
+      <w:numFmt w:val="bullet"/>
+      <w:lvlText w:val="■"/>
+      <w:lvlJc w:val="left"/>
+      <w:pPr>
+        <w:ind w:left="2160" w:hanging="360"/>
+      </w:pPr>
+      <w:rPr>
+        <w:u w:val="none"/>
+      </w:rPr>
+    </w:lvl>
+    <w:lvl w:ilvl="3">
+      <w:start w:val="1"/>
+      <w:numFmt w:val="bullet"/>
+      <w:lvlText w:val="●"/>
+      <w:lvlJc w:val="left"/>
+      <w:pPr>
+        <w:ind w:left="2880" w:hanging="360"/>
+      </w:pPr>
+      <w:rPr>
+        <w:u w:val="none"/>
+      </w:rPr>
+    </w:lvl>
+    <w:lvl w:ilvl="4">
+      <w:start w:val="1"/>
+      <w:numFmt w:val="bullet"/>
+      <w:lvlText w:val="○"/>
+      <w:lvlJc w:val="left"/>
+      <w:pPr>
+        <w:ind w:left="3600" w:hanging="360"/>
+      </w:pPr>
+      <w:rPr>
+        <w:u w:val="none"/>
+      </w:rPr>
+    </w:lvl>
+    <w:lvl w:ilvl="5">
+      <w:start w:val="1"/>
+      <w:numFmt w:val="bullet"/>
+      <w:lvlText w:val="■"/>
+      <w:lvlJc w:val="left"/>
+      <w:pPr>
+        <w:ind w:left="4320" w:hanging="360"/>
+      </w:pPr>
+      <w:rPr>
+        <w:u w:val="none"/>
+      </w:rPr>
+    </w:lvl>
+    <w:lvl w:ilvl="6">
+      <w:start w:val="1"/>
+      <w:numFmt w:val="bullet"/>
+      <w:lvlText w:val="●"/>
+      <w:lvlJc w:val="left"/>
+      <w:pPr>
+        <w:ind w:left="5040" w:hanging="360"/>
+      </w:pPr>
+      <w:rPr>
+        <w:u w:val="none"/>
+      </w:rPr>
+    </w:lvl>
+    <w:lvl w:ilvl="7">
+      <w:start w:val="1"/>
+      <w:numFmt w:val="bullet"/>
+      <w:lvlText w:val="○"/>
+      <w:lvlJc w:val="left"/>
+      <w:pPr>
+        <w:ind w:left="5760" w:hanging="360"/>
+      </w:pPr>
+      <w:rPr>
+        <w:u w:val="none"/>
+      </w:rPr>
+    </w:lvl>
+    <w:lvl w:ilvl="8">
+      <w:start w:val="1"/>
+      <w:numFmt w:val="bullet"/>
+      <w:lvlText w:val="■"/>
+      <w:lvlJc w:val="left"/>
+      <w:pPr>
+        <w:ind w:left="6480" w:hanging="360"/>
+      </w:pPr>
+      <w:rPr>
+        <w:u w:val="none"/>
+      </w:rPr>
+    </w:lvl>
+  </w:abstractNum>
+  <w:abstractNum w:abstractNumId="18">
+    <w:lvl w:ilvl="0">
+      <w:start w:val="1"/>
+      <w:numFmt w:val="bullet"/>
+      <w:lvlText w:val="●"/>
+      <w:lvlJc w:val="left"/>
+      <w:pPr>
+        <w:ind w:left="720" w:hanging="360"/>
+      </w:pPr>
+      <w:rPr>
+        <w:rFonts w:ascii="Arial" w:cs="Arial" w:eastAsia="Arial" w:hAnsi="Arial"/>
+        <w:u w:val="none"/>
+      </w:rPr>
+    </w:lvl>
+    <w:lvl w:ilvl="1">
+      <w:start w:val="1"/>
+      <w:numFmt w:val="bullet"/>
+      <w:lvlText w:val="○"/>
+      <w:lvlJc w:val="left"/>
+      <w:pPr>
+        <w:ind w:left="1440" w:hanging="360"/>
+      </w:pPr>
+      <w:rPr>
+        <w:rFonts w:ascii="Arial" w:cs="Arial" w:eastAsia="Arial" w:hAnsi="Arial"/>
+        <w:u w:val="none"/>
+      </w:rPr>
+    </w:lvl>
+    <w:lvl w:ilvl="2">
+      <w:start w:val="1"/>
       <w:numFmt w:val="decimal"/>
       <w:lvlText w:val="%3."/>
       <w:lvlJc w:val="left"/>
@@ -4410,6 +5129,98 @@
       <w:rPr>
         <w:u w:val="none"/>
       </w:rPr>
+    </w:lvl>
+  </w:abstractNum>
+  <w:abstractNum w:abstractNumId="19">
+    <w:lvl w:ilvl="0">
+      <w:start w:val="1"/>
+      <w:numFmt w:val="bullet"/>
+      <w:lvlText w:val="●"/>
+      <w:lvlJc w:val="left"/>
+      <w:pPr>
+        <w:ind w:left="720" w:hanging="360"/>
+      </w:pPr>
+      <w:rPr/>
+    </w:lvl>
+    <w:lvl w:ilvl="1">
+      <w:start w:val="1"/>
+      <w:numFmt w:val="bullet"/>
+      <w:lvlText w:val="○"/>
+      <w:lvlJc w:val="left"/>
+      <w:pPr>
+        <w:ind w:left="1440" w:hanging="360"/>
+      </w:pPr>
+      <w:rPr/>
+    </w:lvl>
+    <w:lvl w:ilvl="2">
+      <w:start w:val="1"/>
+      <w:numFmt w:val="bullet"/>
+      <w:lvlText w:val="■"/>
+      <w:lvlJc w:val="left"/>
+      <w:pPr>
+        <w:ind w:left="2160" w:hanging="360"/>
+      </w:pPr>
+      <w:rPr/>
+    </w:lvl>
+    <w:lvl w:ilvl="3">
+      <w:start w:val="1"/>
+      <w:numFmt w:val="bullet"/>
+      <w:lvlText w:val="●"/>
+      <w:lvlJc w:val="left"/>
+      <w:pPr>
+        <w:ind w:left="2880" w:hanging="360"/>
+      </w:pPr>
+      <w:rPr/>
+    </w:lvl>
+    <w:lvl w:ilvl="4">
+      <w:start w:val="1"/>
+      <w:numFmt w:val="bullet"/>
+      <w:lvlText w:val="○"/>
+      <w:lvlJc w:val="left"/>
+      <w:pPr>
+        <w:ind w:left="3600" w:hanging="360"/>
+      </w:pPr>
+      <w:rPr/>
+    </w:lvl>
+    <w:lvl w:ilvl="5">
+      <w:start w:val="1"/>
+      <w:numFmt w:val="bullet"/>
+      <w:lvlText w:val="■"/>
+      <w:lvlJc w:val="left"/>
+      <w:pPr>
+        <w:ind w:left="4320" w:hanging="360"/>
+      </w:pPr>
+      <w:rPr/>
+    </w:lvl>
+    <w:lvl w:ilvl="6">
+      <w:start w:val="1"/>
+      <w:numFmt w:val="bullet"/>
+      <w:lvlText w:val="●"/>
+      <w:lvlJc w:val="left"/>
+      <w:pPr>
+        <w:ind w:left="5040" w:hanging="360"/>
+      </w:pPr>
+      <w:rPr/>
+    </w:lvl>
+    <w:lvl w:ilvl="7">
+      <w:start w:val="1"/>
+      <w:numFmt w:val="bullet"/>
+      <w:lvlText w:val="○"/>
+      <w:lvlJc w:val="left"/>
+      <w:pPr>
+        <w:ind w:left="5760" w:hanging="360"/>
+      </w:pPr>
+      <w:rPr/>
+    </w:lvl>
+    <w:lvl w:ilvl="8">
+      <w:start w:val="1"/>
+      <w:numFmt w:val="bullet"/>
+      <w:lvlText w:val="■"/>
+      <w:lvlJc w:val="left"/>
+      <w:pPr>
+        <w:ind w:left="6480" w:hanging="360"/>
+      </w:pPr>
+      <w:rPr/>
     </w:lvl>
   </w:abstractNum>
   <w:num w:numId="1">
@@ -4456,6 +5267,18 @@
   </w:num>
   <w:num w:numId="15">
     <w:abstractNumId w:val="15"/>
+  </w:num>
+  <w:num w:numId="16">
+    <w:abstractNumId w:val="16"/>
+  </w:num>
+  <w:num w:numId="17">
+    <w:abstractNumId w:val="17"/>
+  </w:num>
+  <w:num w:numId="18">
+    <w:abstractNumId w:val="18"/>
+  </w:num>
+  <w:num w:numId="19">
+    <w:abstractNumId w:val="19"/>
   </w:num>
 </w:numbering>
 </file>

</xml_diff>